<commit_message>
Optimize PBCTOPO and refresh manuscript artifacts
</commit_message>
<xml_diff>
--- a/docs/fagbi_guarded_p4_package/submission_preview_synced/titan_fagbi_paper_standard_revised_p2_coverage_supplement.docx
+++ b/docs/fagbi_guarded_p4_package/submission_preview_synced/titan_fagbi_paper_standard_revised_p2_coverage_supplement.docx
@@ -11,9 +11,11 @@
           <w:rFonts w:ascii="Calibri" w:hAnsi="Calibri"/>
           <w:b/>
           <w:color w:val="0B2545"/>
-          <w:sz w:val="34"/>
+          <w:sz w:val="30"/>
         </w:rPr>
-        <w:t>Supplementary Tables and Sensitivity Figures for the Guarded p4 TABI Treecode</w:t>
+        <w:t>Supplementary Information for TITAN Guarded Cartesian FMM/M2L</w:t>
+        <w:br/>
+        <w:t>Boundary-Integral Poisson-Boltzmann Solves</w:t>
       </w:r>
     </w:p>
     <w:p>
@@ -24,17 +26,17 @@
         <w:rPr>
           <w:i/>
         </w:rPr>
-        <w:t>Public-protein expansion, theta/guard/tail sensitivity, and ILU neighbor-cap sensitivity</w:t>
+        <w:t>Public-protein expansion, guarded-operator sensitivity, ILU neighbor-cap sensitivity, and APBS grid context</w:t>
       </w:r>
     </w:p>
     <w:p>
       <w:r>
-        <w:t>This supplement is generated from the completed public-protein, ablation, and ILU neighbor-cap artifacts. It does not rerun the solver. The purpose is to keep supplementary evidence out of the main manuscript while preserving reviewer-auditable tables and figures.</w:t>
+        <w:t>This Supplementary Information reports additional public-protein rows, guarded-operator sensitivity, ILU neighbor-cap sensitivity, and APBS grid-solver context used to support the bounded claims in the main manuscript. The tables summarize solver outputs generated under the archived TITAN manuscript release.</w:t>
       </w:r>
     </w:p>
     <w:p>
       <w:r>
-        <w:t>ILU neighbor-cap evidence is taken from the Z4X-F real sweep on Barnase, 1A63, and 1SH1. All three tested caps preserve the direct-operator verification gates; cap 64 is retained in the reported guarded-p4 protocol because it gives the best average matvec time while avoiding the larger sparse graph and RSS of cap 128.</w:t>
+        <w:t>For the ILU near-field graph, neighbor caps 32, 64, and 128 were tested on Barnase, 1A63, and 1SH1. All three caps preserved the sampled direct-operator verification gates. Cap 64 is retained in the reported guarded-p4 protocol because it gave the lowest mean matvec time in this sweep while avoiding the larger sparse graph and RSS of cap 128. No global cap optimum is claimed.</w:t>
       </w:r>
     </w:p>
     <w:p>
@@ -16707,7 +16709,7 @@
       <w:r>
         <w:drawing>
           <wp:inline xmlns:a="http://schemas.openxmlformats.org/drawingml/2006/main" xmlns:pic="http://schemas.openxmlformats.org/drawingml/2006/picture">
-            <wp:extent cx="8503920" cy="2680023"/>
+            <wp:extent cx="8503920" cy="2510681"/>
             <wp:docPr id="1" name="Picture 1"/>
             <wp:cNvGraphicFramePr>
               <a:graphicFrameLocks noChangeAspect="1"/>
@@ -16728,7 +16730,7 @@
                   <pic:spPr>
                     <a:xfrm>
                       <a:off x="0" y="0"/>
-                      <a:ext cx="8503920" cy="2680023"/>
+                      <a:ext cx="8503920" cy="2510681"/>
                     </a:xfrm>
                     <a:prstGeom prst="rect"/>
                   </pic:spPr>
@@ -16745,6 +16747,1104 @@
       </w:pPr>
       <w:r>
         <w:t>A, maximum sampled direct residual across Barnase, 1A63, and 1SH1, with the 8 x 10^-3 verification gate shown as a red reference line. B, mean GMRES matvec time. C, mean process peak RSS. Error bars show sample standard deviation over the three proteins. The sweep shows that cap 32, 64, and 128 all pass accuracy; cap 64 is a balanced protocol value rather than an accuracy-only optimum.</w:t>
+      </w:r>
+    </w:p>
+    <w:p>
+      <w:pPr>
+        <w:pStyle w:val="Heading2"/>
+      </w:pPr>
+      <w:r>
+        <w:t>Table S5. APBS grid-solver context for matched public PQR inputs.</w:t>
+      </w:r>
+    </w:p>
+    <w:tbl>
+      <w:tblPr>
+        <w:tblStyle w:val="TableGrid"/>
+        <w:tblW w:type="auto" w:w="0"/>
+        <w:tblLayout w:type="fixed"/>
+        <w:tblLook w:firstColumn="1" w:firstRow="1" w:lastColumn="0" w:lastRow="0" w:noHBand="0" w:noVBand="1" w:val="04A0"/>
+      </w:tblPr>
+      <w:tblGrid>
+        <w:gridCol w:w="1086"/>
+        <w:gridCol w:w="1086"/>
+        <w:gridCol w:w="1086"/>
+        <w:gridCol w:w="1086"/>
+        <w:gridCol w:w="1086"/>
+        <w:gridCol w:w="1086"/>
+        <w:gridCol w:w="1086"/>
+        <w:gridCol w:w="1086"/>
+        <w:gridCol w:w="1086"/>
+        <w:gridCol w:w="1086"/>
+        <w:gridCol w:w="1086"/>
+        <w:gridCol w:w="1086"/>
+        <w:gridCol w:w="1086"/>
+      </w:tblGrid>
+      <w:tr>
+        <w:tc>
+          <w:tcPr>
+            <w:tcW w:type="dxa" w:w="1944"/>
+            <w:vAlign w:val="center"/>
+            <w:shd w:fill="E8EEF5"/>
+          </w:tcPr>
+          <w:p>
+            <w:pPr>
+              <w:jc w:val="left"/>
+            </w:pPr>
+            <w:r/>
+            <w:r>
+              <w:rPr>
+                <w:rFonts w:ascii="Calibri" w:hAnsi="Calibri"/>
+                <w:b/>
+                <w:sz w:val="16"/>
+              </w:rPr>
+              <w:t>Protein</w:t>
+            </w:r>
+          </w:p>
+        </w:tc>
+        <w:tc>
+          <w:tcPr>
+            <w:tcW w:type="dxa" w:w="936"/>
+            <w:vAlign w:val="center"/>
+            <w:shd w:fill="E8EEF5"/>
+          </w:tcPr>
+          <w:p>
+            <w:pPr>
+              <w:jc w:val="left"/>
+            </w:pPr>
+            <w:r/>
+            <w:r>
+              <w:rPr>
+                <w:rFonts w:ascii="Calibri" w:hAnsi="Calibri"/>
+                <w:b/>
+                <w:sz w:val="16"/>
+              </w:rPr>
+              <w:t>PDB</w:t>
+            </w:r>
+          </w:p>
+        </w:tc>
+        <w:tc>
+          <w:tcPr>
+            <w:tcW w:type="dxa" w:w="1007"/>
+            <w:vAlign w:val="center"/>
+            <w:shd w:fill="E8EEF5"/>
+          </w:tcPr>
+          <w:p>
+            <w:pPr>
+              <w:jc w:val="left"/>
+            </w:pPr>
+            <w:r/>
+            <w:r>
+              <w:rPr>
+                <w:rFonts w:ascii="Calibri" w:hAnsi="Calibri"/>
+                <w:b/>
+                <w:sz w:val="16"/>
+              </w:rPr>
+              <w:t>APBS grid</w:t>
+            </w:r>
+          </w:p>
+        </w:tc>
+        <w:tc>
+          <w:tcPr>
+            <w:tcW w:type="dxa" w:w="1224"/>
+            <w:vAlign w:val="center"/>
+            <w:shd w:fill="E8EEF5"/>
+          </w:tcPr>
+          <w:p>
+            <w:pPr>
+              <w:jc w:val="left"/>
+            </w:pPr>
+            <w:r/>
+            <w:r>
+              <w:rPr>
+                <w:rFonts w:ascii="Calibri" w:hAnsi="Calibri"/>
+                <w:b/>
+                <w:sz w:val="16"/>
+              </w:rPr>
+              <w:t>TITAN energy</w:t>
+            </w:r>
+          </w:p>
+        </w:tc>
+        <w:tc>
+          <w:tcPr>
+            <w:tcW w:type="dxa" w:w="1296"/>
+            <w:vAlign w:val="center"/>
+            <w:shd w:fill="E8EEF5"/>
+          </w:tcPr>
+          <w:p>
+            <w:pPr>
+              <w:jc w:val="left"/>
+            </w:pPr>
+            <w:r/>
+            <w:r>
+              <w:rPr>
+                <w:rFonts w:ascii="Calibri" w:hAnsi="Calibri"/>
+                <w:b/>
+                <w:sz w:val="16"/>
+              </w:rPr>
+              <w:t>APBS finest energy</w:t>
+            </w:r>
+          </w:p>
+        </w:tc>
+        <w:tc>
+          <w:tcPr>
+            <w:tcW w:type="dxa" w:w="1296"/>
+            <w:vAlign w:val="center"/>
+            <w:shd w:fill="E8EEF5"/>
+          </w:tcPr>
+          <w:p>
+            <w:pPr>
+              <w:jc w:val="left"/>
+            </w:pPr>
+            <w:r/>
+            <w:r>
+              <w:rPr>
+                <w:rFonts w:ascii="Calibri" w:hAnsi="Calibri"/>
+                <w:b/>
+                <w:sz w:val="16"/>
+              </w:rPr>
+              <w:t>APBS last-step change</w:t>
+            </w:r>
+          </w:p>
+        </w:tc>
+        <w:tc>
+          <w:tcPr>
+            <w:tcW w:type="dxa" w:w="1224"/>
+            <w:vAlign w:val="center"/>
+            <w:shd w:fill="E8EEF5"/>
+          </w:tcPr>
+          <w:p>
+            <w:pPr>
+              <w:jc w:val="left"/>
+            </w:pPr>
+            <w:r/>
+            <w:r>
+              <w:rPr>
+                <w:rFonts w:ascii="Calibri" w:hAnsi="Calibri"/>
+                <w:b/>
+                <w:sz w:val="16"/>
+              </w:rPr>
+              <w:t>Last-step change (%)</w:t>
+            </w:r>
+          </w:p>
+        </w:tc>
+        <w:tc>
+          <w:tcPr>
+            <w:tcW w:type="dxa" w:w="1080"/>
+            <w:vAlign w:val="center"/>
+            <w:shd w:fill="E8EEF5"/>
+          </w:tcPr>
+          <w:p>
+            <w:pPr>
+              <w:jc w:val="left"/>
+            </w:pPr>
+            <w:r/>
+            <w:r>
+              <w:rPr>
+                <w:rFonts w:ascii="Calibri" w:hAnsi="Calibri"/>
+                <w:b/>
+                <w:sz w:val="16"/>
+              </w:rPr>
+              <w:t>TITAN RSS MB</w:t>
+            </w:r>
+          </w:p>
+        </w:tc>
+        <w:tc>
+          <w:tcPr>
+            <w:tcW w:type="dxa" w:w="1080"/>
+            <w:vAlign w:val="center"/>
+            <w:shd w:fill="E8EEF5"/>
+          </w:tcPr>
+          <w:p>
+            <w:pPr>
+              <w:jc w:val="left"/>
+            </w:pPr>
+            <w:r/>
+            <w:r>
+              <w:rPr>
+                <w:rFonts w:ascii="Calibri" w:hAnsi="Calibri"/>
+                <w:b/>
+                <w:sz w:val="16"/>
+              </w:rPr>
+              <w:t>APBS RSS MB</w:t>
+            </w:r>
+          </w:p>
+        </w:tc>
+        <w:tc>
+          <w:tcPr>
+            <w:tcW w:type="dxa" w:w="1152"/>
+            <w:vAlign w:val="center"/>
+            <w:shd w:fill="E8EEF5"/>
+          </w:tcPr>
+          <w:p>
+            <w:pPr>
+              <w:jc w:val="left"/>
+            </w:pPr>
+            <w:r/>
+            <w:r>
+              <w:rPr>
+                <w:rFonts w:ascii="Calibri" w:hAnsi="Calibri"/>
+                <w:b/>
+                <w:sz w:val="16"/>
+              </w:rPr>
+              <w:t>APBS/TITAN RSS</w:t>
+            </w:r>
+          </w:p>
+        </w:tc>
+        <w:tc>
+          <w:tcPr>
+            <w:tcW w:type="dxa" w:w="1080"/>
+            <w:vAlign w:val="center"/>
+            <w:shd w:fill="E8EEF5"/>
+          </w:tcPr>
+          <w:p>
+            <w:pPr>
+              <w:jc w:val="left"/>
+            </w:pPr>
+            <w:r/>
+            <w:r>
+              <w:rPr>
+                <w:rFonts w:ascii="Calibri" w:hAnsi="Calibri"/>
+                <w:b/>
+                <w:sz w:val="16"/>
+              </w:rPr>
+              <w:t>TITAN wall (s)</w:t>
+            </w:r>
+          </w:p>
+        </w:tc>
+        <w:tc>
+          <w:tcPr>
+            <w:tcW w:type="dxa" w:w="1080"/>
+            <w:vAlign w:val="center"/>
+            <w:shd w:fill="E8EEF5"/>
+          </w:tcPr>
+          <w:p>
+            <w:pPr>
+              <w:jc w:val="left"/>
+            </w:pPr>
+            <w:r/>
+            <w:r>
+              <w:rPr>
+                <w:rFonts w:ascii="Calibri" w:hAnsi="Calibri"/>
+                <w:b/>
+                <w:sz w:val="16"/>
+              </w:rPr>
+              <w:t>APBS wall (s)</w:t>
+            </w:r>
+          </w:p>
+        </w:tc>
+        <w:tc>
+          <w:tcPr>
+            <w:tcW w:type="dxa" w:w="3168"/>
+            <w:vAlign w:val="center"/>
+            <w:shd w:fill="E8EEF5"/>
+          </w:tcPr>
+          <w:p>
+            <w:pPr>
+              <w:jc w:val="left"/>
+            </w:pPr>
+            <w:r/>
+            <w:r>
+              <w:rPr>
+                <w:rFonts w:ascii="Calibri" w:hAnsi="Calibri"/>
+                <w:b/>
+                <w:sz w:val="16"/>
+              </w:rPr>
+              <w:t>Interpretation</w:t>
+            </w:r>
+          </w:p>
+        </w:tc>
+      </w:tr>
+      <w:tr>
+        <w:tc>
+          <w:tcPr>
+            <w:tcW w:type="dxa" w:w="1944"/>
+            <w:vAlign w:val="center"/>
+          </w:tcPr>
+          <w:p>
+            <w:pPr>
+              <w:jc w:val="left"/>
+            </w:pPr>
+            <w:r/>
+            <w:r>
+              <w:rPr>
+                <w:rFonts w:ascii="Calibri" w:hAnsi="Calibri"/>
+                <w:b w:val="0"/>
+                <w:sz w:val="14"/>
+              </w:rPr>
+              <w:t>Ubiquitin</w:t>
+            </w:r>
+          </w:p>
+        </w:tc>
+        <w:tc>
+          <w:tcPr>
+            <w:tcW w:type="dxa" w:w="936"/>
+            <w:vAlign w:val="center"/>
+          </w:tcPr>
+          <w:p>
+            <w:pPr>
+              <w:jc w:val="left"/>
+            </w:pPr>
+            <w:r/>
+            <w:r>
+              <w:rPr>
+                <w:rFonts w:ascii="Calibri" w:hAnsi="Calibri"/>
+                <w:b w:val="0"/>
+                <w:sz w:val="14"/>
+              </w:rPr>
+              <w:t>1UBQ</w:t>
+            </w:r>
+          </w:p>
+        </w:tc>
+        <w:tc>
+          <w:tcPr>
+            <w:tcW w:type="dxa" w:w="1007"/>
+            <w:vAlign w:val="center"/>
+          </w:tcPr>
+          <w:p>
+            <w:pPr>
+              <w:jc w:val="left"/>
+            </w:pPr>
+            <w:r/>
+            <w:r>
+              <w:rPr>
+                <w:rFonts w:ascii="Calibri" w:hAnsi="Calibri"/>
+                <w:b w:val="0"/>
+                <w:sz w:val="14"/>
+              </w:rPr>
+              <w:t>97-257</w:t>
+            </w:r>
+          </w:p>
+        </w:tc>
+        <w:tc>
+          <w:tcPr>
+            <w:tcW w:type="dxa" w:w="1224"/>
+            <w:vAlign w:val="center"/>
+          </w:tcPr>
+          <w:p>
+            <w:pPr>
+              <w:jc w:val="left"/>
+            </w:pPr>
+            <w:r/>
+            <w:r>
+              <w:rPr>
+                <w:rFonts w:ascii="Calibri" w:hAnsi="Calibri"/>
+                <w:b w:val="0"/>
+                <w:sz w:val="14"/>
+              </w:rPr>
+              <w:t>-4038.46</w:t>
+            </w:r>
+          </w:p>
+        </w:tc>
+        <w:tc>
+          <w:tcPr>
+            <w:tcW w:type="dxa" w:w="1296"/>
+            <w:vAlign w:val="center"/>
+          </w:tcPr>
+          <w:p>
+            <w:pPr>
+              <w:jc w:val="left"/>
+            </w:pPr>
+            <w:r/>
+            <w:r>
+              <w:rPr>
+                <w:rFonts w:ascii="Calibri" w:hAnsi="Calibri"/>
+                <w:b w:val="0"/>
+                <w:sz w:val="14"/>
+              </w:rPr>
+              <w:t>-4837.33</w:t>
+            </w:r>
+          </w:p>
+        </w:tc>
+        <w:tc>
+          <w:tcPr>
+            <w:tcW w:type="dxa" w:w="1296"/>
+            <w:vAlign w:val="center"/>
+          </w:tcPr>
+          <w:p>
+            <w:pPr>
+              <w:jc w:val="left"/>
+            </w:pPr>
+            <w:r/>
+            <w:r>
+              <w:rPr>
+                <w:rFonts w:ascii="Calibri" w:hAnsi="Calibri"/>
+                <w:b w:val="0"/>
+                <w:sz w:val="14"/>
+              </w:rPr>
+              <w:t>-174.58</w:t>
+            </w:r>
+          </w:p>
+        </w:tc>
+        <w:tc>
+          <w:tcPr>
+            <w:tcW w:type="dxa" w:w="1224"/>
+            <w:vAlign w:val="center"/>
+          </w:tcPr>
+          <w:p>
+            <w:pPr>
+              <w:jc w:val="left"/>
+            </w:pPr>
+            <w:r/>
+            <w:r>
+              <w:rPr>
+                <w:rFonts w:ascii="Calibri" w:hAnsi="Calibri"/>
+                <w:b w:val="0"/>
+                <w:sz w:val="14"/>
+              </w:rPr>
+              <w:t>3.61</w:t>
+            </w:r>
+          </w:p>
+        </w:tc>
+        <w:tc>
+          <w:tcPr>
+            <w:tcW w:type="dxa" w:w="1080"/>
+            <w:vAlign w:val="center"/>
+          </w:tcPr>
+          <w:p>
+            <w:pPr>
+              <w:jc w:val="left"/>
+            </w:pPr>
+            <w:r/>
+            <w:r>
+              <w:rPr>
+                <w:rFonts w:ascii="Calibri" w:hAnsi="Calibri"/>
+                <w:b w:val="0"/>
+                <w:sz w:val="14"/>
+              </w:rPr>
+              <w:t>150.3</w:t>
+            </w:r>
+          </w:p>
+        </w:tc>
+        <w:tc>
+          <w:tcPr>
+            <w:tcW w:type="dxa" w:w="1080"/>
+            <w:vAlign w:val="center"/>
+          </w:tcPr>
+          <w:p>
+            <w:pPr>
+              <w:jc w:val="left"/>
+            </w:pPr>
+            <w:r/>
+            <w:r>
+              <w:rPr>
+                <w:rFonts w:ascii="Calibri" w:hAnsi="Calibri"/>
+                <w:b w:val="0"/>
+                <w:sz w:val="14"/>
+              </w:rPr>
+              <w:t>3546.8</w:t>
+            </w:r>
+          </w:p>
+        </w:tc>
+        <w:tc>
+          <w:tcPr>
+            <w:tcW w:type="dxa" w:w="1152"/>
+            <w:vAlign w:val="center"/>
+          </w:tcPr>
+          <w:p>
+            <w:pPr>
+              <w:jc w:val="left"/>
+            </w:pPr>
+            <w:r/>
+            <w:r>
+              <w:rPr>
+                <w:rFonts w:ascii="Calibri" w:hAnsi="Calibri"/>
+                <w:b w:val="0"/>
+                <w:sz w:val="14"/>
+              </w:rPr>
+              <w:t>23.6</w:t>
+            </w:r>
+          </w:p>
+        </w:tc>
+        <w:tc>
+          <w:tcPr>
+            <w:tcW w:type="dxa" w:w="1080"/>
+            <w:vAlign w:val="center"/>
+          </w:tcPr>
+          <w:p>
+            <w:pPr>
+              <w:jc w:val="left"/>
+            </w:pPr>
+            <w:r/>
+            <w:r>
+              <w:rPr>
+                <w:rFonts w:ascii="Calibri" w:hAnsi="Calibri"/>
+                <w:b w:val="0"/>
+                <w:sz w:val="14"/>
+              </w:rPr>
+              <w:t>93</w:t>
+            </w:r>
+          </w:p>
+        </w:tc>
+        <w:tc>
+          <w:tcPr>
+            <w:tcW w:type="dxa" w:w="1080"/>
+            <w:vAlign w:val="center"/>
+          </w:tcPr>
+          <w:p>
+            <w:pPr>
+              <w:jc w:val="left"/>
+            </w:pPr>
+            <w:r/>
+            <w:r>
+              <w:rPr>
+                <w:rFonts w:ascii="Calibri" w:hAnsi="Calibri"/>
+                <w:b w:val="0"/>
+                <w:sz w:val="14"/>
+              </w:rPr>
+              <w:t>101.1</w:t>
+            </w:r>
+          </w:p>
+        </w:tc>
+        <w:tc>
+          <w:tcPr>
+            <w:tcW w:type="dxa" w:w="3168"/>
+            <w:vAlign w:val="center"/>
+          </w:tcPr>
+          <w:p>
+            <w:pPr>
+              <w:jc w:val="left"/>
+            </w:pPr>
+            <w:r/>
+            <w:r>
+              <w:rPr>
+                <w:rFonts w:ascii="Calibri" w:hAnsi="Calibri"/>
+                <w:b w:val="0"/>
+                <w:sz w:val="14"/>
+              </w:rPr>
+              <w:t>Grid-solver context; APBS is not used as the dense boundary-integral oracle.</w:t>
+            </w:r>
+          </w:p>
+        </w:tc>
+      </w:tr>
+      <w:tr>
+        <w:tc>
+          <w:tcPr>
+            <w:tcW w:type="dxa" w:w="1944"/>
+            <w:vAlign w:val="center"/>
+          </w:tcPr>
+          <w:p>
+            <w:pPr>
+              <w:jc w:val="left"/>
+            </w:pPr>
+            <w:r/>
+            <w:r>
+              <w:rPr>
+                <w:rFonts w:ascii="Calibri" w:hAnsi="Calibri"/>
+                <w:b w:val="0"/>
+                <w:sz w:val="14"/>
+              </w:rPr>
+              <w:t>Villin headpiece subdomain</w:t>
+            </w:r>
+          </w:p>
+        </w:tc>
+        <w:tc>
+          <w:tcPr>
+            <w:tcW w:type="dxa" w:w="936"/>
+            <w:vAlign w:val="center"/>
+          </w:tcPr>
+          <w:p>
+            <w:pPr>
+              <w:jc w:val="left"/>
+            </w:pPr>
+            <w:r/>
+            <w:r>
+              <w:rPr>
+                <w:rFonts w:ascii="Calibri" w:hAnsi="Calibri"/>
+                <w:b w:val="0"/>
+                <w:sz w:val="14"/>
+              </w:rPr>
+              <w:t>1VII</w:t>
+            </w:r>
+          </w:p>
+        </w:tc>
+        <w:tc>
+          <w:tcPr>
+            <w:tcW w:type="dxa" w:w="1007"/>
+            <w:vAlign w:val="center"/>
+          </w:tcPr>
+          <w:p>
+            <w:pPr>
+              <w:jc w:val="left"/>
+            </w:pPr>
+            <w:r/>
+            <w:r>
+              <w:rPr>
+                <w:rFonts w:ascii="Calibri" w:hAnsi="Calibri"/>
+                <w:b w:val="0"/>
+                <w:sz w:val="14"/>
+              </w:rPr>
+              <w:t>97-257</w:t>
+            </w:r>
+          </w:p>
+        </w:tc>
+        <w:tc>
+          <w:tcPr>
+            <w:tcW w:type="dxa" w:w="1224"/>
+            <w:vAlign w:val="center"/>
+          </w:tcPr>
+          <w:p>
+            <w:pPr>
+              <w:jc w:val="left"/>
+            </w:pPr>
+            <w:r/>
+            <w:r>
+              <w:rPr>
+                <w:rFonts w:ascii="Calibri" w:hAnsi="Calibri"/>
+                <w:b w:val="0"/>
+                <w:sz w:val="14"/>
+              </w:rPr>
+              <w:t>-2355.7</w:t>
+            </w:r>
+          </w:p>
+        </w:tc>
+        <w:tc>
+          <w:tcPr>
+            <w:tcW w:type="dxa" w:w="1296"/>
+            <w:vAlign w:val="center"/>
+          </w:tcPr>
+          <w:p>
+            <w:pPr>
+              <w:jc w:val="left"/>
+            </w:pPr>
+            <w:r/>
+            <w:r>
+              <w:rPr>
+                <w:rFonts w:ascii="Calibri" w:hAnsi="Calibri"/>
+                <w:b w:val="0"/>
+                <w:sz w:val="14"/>
+              </w:rPr>
+              <w:t>-3608.92</w:t>
+            </w:r>
+          </w:p>
+        </w:tc>
+        <w:tc>
+          <w:tcPr>
+            <w:tcW w:type="dxa" w:w="1296"/>
+            <w:vAlign w:val="center"/>
+          </w:tcPr>
+          <w:p>
+            <w:pPr>
+              <w:jc w:val="left"/>
+            </w:pPr>
+            <w:r/>
+            <w:r>
+              <w:rPr>
+                <w:rFonts w:ascii="Calibri" w:hAnsi="Calibri"/>
+                <w:b w:val="0"/>
+                <w:sz w:val="14"/>
+              </w:rPr>
+              <w:t>1.64</w:t>
+            </w:r>
+          </w:p>
+        </w:tc>
+        <w:tc>
+          <w:tcPr>
+            <w:tcW w:type="dxa" w:w="1224"/>
+            <w:vAlign w:val="center"/>
+          </w:tcPr>
+          <w:p>
+            <w:pPr>
+              <w:jc w:val="left"/>
+            </w:pPr>
+            <w:r/>
+            <w:r>
+              <w:rPr>
+                <w:rFonts w:ascii="Calibri" w:hAnsi="Calibri"/>
+                <w:b w:val="0"/>
+                <w:sz w:val="14"/>
+              </w:rPr>
+              <w:t>0.05</w:t>
+            </w:r>
+          </w:p>
+        </w:tc>
+        <w:tc>
+          <w:tcPr>
+            <w:tcW w:type="dxa" w:w="1080"/>
+            <w:vAlign w:val="center"/>
+          </w:tcPr>
+          <w:p>
+            <w:pPr>
+              <w:jc w:val="left"/>
+            </w:pPr>
+            <w:r/>
+            <w:r>
+              <w:rPr>
+                <w:rFonts w:ascii="Calibri" w:hAnsi="Calibri"/>
+                <w:b w:val="0"/>
+                <w:sz w:val="14"/>
+              </w:rPr>
+              <w:t>58.2</w:t>
+            </w:r>
+          </w:p>
+        </w:tc>
+        <w:tc>
+          <w:tcPr>
+            <w:tcW w:type="dxa" w:w="1080"/>
+            <w:vAlign w:val="center"/>
+          </w:tcPr>
+          <w:p>
+            <w:pPr>
+              <w:jc w:val="left"/>
+            </w:pPr>
+            <w:r/>
+            <w:r>
+              <w:rPr>
+                <w:rFonts w:ascii="Calibri" w:hAnsi="Calibri"/>
+                <w:b w:val="0"/>
+                <w:sz w:val="14"/>
+              </w:rPr>
+              <w:t>3498.3</w:t>
+            </w:r>
+          </w:p>
+        </w:tc>
+        <w:tc>
+          <w:tcPr>
+            <w:tcW w:type="dxa" w:w="1152"/>
+            <w:vAlign w:val="center"/>
+          </w:tcPr>
+          <w:p>
+            <w:pPr>
+              <w:jc w:val="left"/>
+            </w:pPr>
+            <w:r/>
+            <w:r>
+              <w:rPr>
+                <w:rFonts w:ascii="Calibri" w:hAnsi="Calibri"/>
+                <w:b w:val="0"/>
+                <w:sz w:val="14"/>
+              </w:rPr>
+              <w:t>60.1</w:t>
+            </w:r>
+          </w:p>
+        </w:tc>
+        <w:tc>
+          <w:tcPr>
+            <w:tcW w:type="dxa" w:w="1080"/>
+            <w:vAlign w:val="center"/>
+          </w:tcPr>
+          <w:p>
+            <w:pPr>
+              <w:jc w:val="left"/>
+            </w:pPr>
+            <w:r/>
+            <w:r>
+              <w:rPr>
+                <w:rFonts w:ascii="Calibri" w:hAnsi="Calibri"/>
+                <w:b w:val="0"/>
+                <w:sz w:val="14"/>
+              </w:rPr>
+              <w:t>17.3</w:t>
+            </w:r>
+          </w:p>
+        </w:tc>
+        <w:tc>
+          <w:tcPr>
+            <w:tcW w:type="dxa" w:w="1080"/>
+            <w:vAlign w:val="center"/>
+          </w:tcPr>
+          <w:p>
+            <w:pPr>
+              <w:jc w:val="left"/>
+            </w:pPr>
+            <w:r/>
+            <w:r>
+              <w:rPr>
+                <w:rFonts w:ascii="Calibri" w:hAnsi="Calibri"/>
+                <w:b w:val="0"/>
+                <w:sz w:val="14"/>
+              </w:rPr>
+              <w:t>55.9</w:t>
+            </w:r>
+          </w:p>
+        </w:tc>
+        <w:tc>
+          <w:tcPr>
+            <w:tcW w:type="dxa" w:w="3168"/>
+            <w:vAlign w:val="center"/>
+          </w:tcPr>
+          <w:p>
+            <w:pPr>
+              <w:jc w:val="left"/>
+            </w:pPr>
+            <w:r/>
+            <w:r>
+              <w:rPr>
+                <w:rFonts w:ascii="Calibri" w:hAnsi="Calibri"/>
+                <w:b w:val="0"/>
+                <w:sz w:val="14"/>
+              </w:rPr>
+              <w:t>Grid-solver context; APBS is not used as the dense boundary-integral oracle.</w:t>
+            </w:r>
+          </w:p>
+        </w:tc>
+      </w:tr>
+      <w:tr>
+        <w:tc>
+          <w:tcPr>
+            <w:tcW w:type="dxa" w:w="1944"/>
+            <w:vAlign w:val="center"/>
+          </w:tcPr>
+          <w:p>
+            <w:pPr>
+              <w:jc w:val="left"/>
+            </w:pPr>
+            <w:r/>
+            <w:r>
+              <w:rPr>
+                <w:rFonts w:ascii="Calibri" w:hAnsi="Calibri"/>
+                <w:b w:val="0"/>
+                <w:sz w:val="14"/>
+              </w:rPr>
+              <w:t>Chymotrypsin inhibitor 2</w:t>
+            </w:r>
+          </w:p>
+        </w:tc>
+        <w:tc>
+          <w:tcPr>
+            <w:tcW w:type="dxa" w:w="936"/>
+            <w:vAlign w:val="center"/>
+          </w:tcPr>
+          <w:p>
+            <w:pPr>
+              <w:jc w:val="left"/>
+            </w:pPr>
+            <w:r/>
+            <w:r>
+              <w:rPr>
+                <w:rFonts w:ascii="Calibri" w:hAnsi="Calibri"/>
+                <w:b w:val="0"/>
+                <w:sz w:val="14"/>
+              </w:rPr>
+              <w:t>2CI2</w:t>
+            </w:r>
+          </w:p>
+        </w:tc>
+        <w:tc>
+          <w:tcPr>
+            <w:tcW w:type="dxa" w:w="1007"/>
+            <w:vAlign w:val="center"/>
+          </w:tcPr>
+          <w:p>
+            <w:pPr>
+              <w:jc w:val="left"/>
+            </w:pPr>
+            <w:r/>
+            <w:r>
+              <w:rPr>
+                <w:rFonts w:ascii="Calibri" w:hAnsi="Calibri"/>
+                <w:b w:val="0"/>
+                <w:sz w:val="14"/>
+              </w:rPr>
+              <w:t>97-257</w:t>
+            </w:r>
+          </w:p>
+        </w:tc>
+        <w:tc>
+          <w:tcPr>
+            <w:tcW w:type="dxa" w:w="1224"/>
+            <w:vAlign w:val="center"/>
+          </w:tcPr>
+          <w:p>
+            <w:pPr>
+              <w:jc w:val="left"/>
+            </w:pPr>
+            <w:r/>
+            <w:r>
+              <w:rPr>
+                <w:rFonts w:ascii="Calibri" w:hAnsi="Calibri"/>
+                <w:b w:val="0"/>
+                <w:sz w:val="14"/>
+              </w:rPr>
+              <w:t>-4891.15</w:t>
+            </w:r>
+          </w:p>
+        </w:tc>
+        <w:tc>
+          <w:tcPr>
+            <w:tcW w:type="dxa" w:w="1296"/>
+            <w:vAlign w:val="center"/>
+          </w:tcPr>
+          <w:p>
+            <w:pPr>
+              <w:jc w:val="left"/>
+            </w:pPr>
+            <w:r/>
+            <w:r>
+              <w:rPr>
+                <w:rFonts w:ascii="Calibri" w:hAnsi="Calibri"/>
+                <w:b w:val="0"/>
+                <w:sz w:val="14"/>
+              </w:rPr>
+              <w:t>-3601.11</w:t>
+            </w:r>
+          </w:p>
+        </w:tc>
+        <w:tc>
+          <w:tcPr>
+            <w:tcW w:type="dxa" w:w="1296"/>
+            <w:vAlign w:val="center"/>
+          </w:tcPr>
+          <w:p>
+            <w:pPr>
+              <w:jc w:val="left"/>
+            </w:pPr>
+            <w:r/>
+            <w:r>
+              <w:rPr>
+                <w:rFonts w:ascii="Calibri" w:hAnsi="Calibri"/>
+                <w:b w:val="0"/>
+                <w:sz w:val="14"/>
+              </w:rPr>
+              <w:t>-40.41</w:t>
+            </w:r>
+          </w:p>
+        </w:tc>
+        <w:tc>
+          <w:tcPr>
+            <w:tcW w:type="dxa" w:w="1224"/>
+            <w:vAlign w:val="center"/>
+          </w:tcPr>
+          <w:p>
+            <w:pPr>
+              <w:jc w:val="left"/>
+            </w:pPr>
+            <w:r/>
+            <w:r>
+              <w:rPr>
+                <w:rFonts w:ascii="Calibri" w:hAnsi="Calibri"/>
+                <w:b w:val="0"/>
+                <w:sz w:val="14"/>
+              </w:rPr>
+              <w:t>1.12</w:t>
+            </w:r>
+          </w:p>
+        </w:tc>
+        <w:tc>
+          <w:tcPr>
+            <w:tcW w:type="dxa" w:w="1080"/>
+            <w:vAlign w:val="center"/>
+          </w:tcPr>
+          <w:p>
+            <w:pPr>
+              <w:jc w:val="left"/>
+            </w:pPr>
+            <w:r/>
+            <w:r>
+              <w:rPr>
+                <w:rFonts w:ascii="Calibri" w:hAnsi="Calibri"/>
+                <w:b w:val="0"/>
+                <w:sz w:val="14"/>
+              </w:rPr>
+              <w:t>144.4</w:t>
+            </w:r>
+          </w:p>
+        </w:tc>
+        <w:tc>
+          <w:tcPr>
+            <w:tcW w:type="dxa" w:w="1080"/>
+            <w:vAlign w:val="center"/>
+          </w:tcPr>
+          <w:p>
+            <w:pPr>
+              <w:jc w:val="left"/>
+            </w:pPr>
+            <w:r/>
+            <w:r>
+              <w:rPr>
+                <w:rFonts w:ascii="Calibri" w:hAnsi="Calibri"/>
+                <w:b w:val="0"/>
+                <w:sz w:val="14"/>
+              </w:rPr>
+              <w:t>3536.2</w:t>
+            </w:r>
+          </w:p>
+        </w:tc>
+        <w:tc>
+          <w:tcPr>
+            <w:tcW w:type="dxa" w:w="1152"/>
+            <w:vAlign w:val="center"/>
+          </w:tcPr>
+          <w:p>
+            <w:pPr>
+              <w:jc w:val="left"/>
+            </w:pPr>
+            <w:r/>
+            <w:r>
+              <w:rPr>
+                <w:rFonts w:ascii="Calibri" w:hAnsi="Calibri"/>
+                <w:b w:val="0"/>
+                <w:sz w:val="14"/>
+              </w:rPr>
+              <w:t>24.5</w:t>
+            </w:r>
+          </w:p>
+        </w:tc>
+        <w:tc>
+          <w:tcPr>
+            <w:tcW w:type="dxa" w:w="1080"/>
+            <w:vAlign w:val="center"/>
+          </w:tcPr>
+          <w:p>
+            <w:pPr>
+              <w:jc w:val="left"/>
+            </w:pPr>
+            <w:r/>
+            <w:r>
+              <w:rPr>
+                <w:rFonts w:ascii="Calibri" w:hAnsi="Calibri"/>
+                <w:b w:val="0"/>
+                <w:sz w:val="14"/>
+              </w:rPr>
+              <w:t>100.3</w:t>
+            </w:r>
+          </w:p>
+        </w:tc>
+        <w:tc>
+          <w:tcPr>
+            <w:tcW w:type="dxa" w:w="1080"/>
+            <w:vAlign w:val="center"/>
+          </w:tcPr>
+          <w:p>
+            <w:pPr>
+              <w:jc w:val="left"/>
+            </w:pPr>
+            <w:r/>
+            <w:r>
+              <w:rPr>
+                <w:rFonts w:ascii="Calibri" w:hAnsi="Calibri"/>
+                <w:b w:val="0"/>
+                <w:sz w:val="14"/>
+              </w:rPr>
+              <w:t>85.1</w:t>
+            </w:r>
+          </w:p>
+        </w:tc>
+        <w:tc>
+          <w:tcPr>
+            <w:tcW w:type="dxa" w:w="3168"/>
+            <w:vAlign w:val="center"/>
+          </w:tcPr>
+          <w:p>
+            <w:pPr>
+              <w:jc w:val="left"/>
+            </w:pPr>
+            <w:r/>
+            <w:r>
+              <w:rPr>
+                <w:rFonts w:ascii="Calibri" w:hAnsi="Calibri"/>
+                <w:b w:val="0"/>
+                <w:sz w:val="14"/>
+              </w:rPr>
+              <w:t>Grid-solver context; APBS is not used as the dense boundary-integral oracle.</w:t>
+            </w:r>
+          </w:p>
+        </w:tc>
+      </w:tr>
+    </w:tbl>
+    <w:p/>
+    <w:p>
+      <w:r>
+        <w:t>APBS is included as an independent grid-solver sanity/context check, not as the dense boundary-integral oracle. The APBS rows use the same PQR inputs as TITAN but a volumetric grid discretization; the highest tested APBS grids required substantially more peak RSS than the corresponding guarded p4 rows and still showed measurable grid sensitivity for some systems.</w:t>
       </w:r>
     </w:p>
     <w:p>

</xml_diff>